<commit_message>
BIA brief on appeal: fb render builds the docx (render.sh and build-reference.sh deleted): docx/reference.xml (the court styles on pandoc's reference, the typst face as {font}: Times New Roman for Liberation Serif), bia.lua writes needles for the contents pages, the A-number footer (from $FORMBOOK_META) and the last section. Byte-identical .docx.pdf with the old face; then the face (TNR-EMBEDDED now passes), footnotes numbered through the document (LibreOffice read numRestart eachSect as a restart on every page: DEF-CONT-001 now passes) and no footer on the cover. check.sh docx 2 failed -> 0 failed, typst 0 failed; two baseline entries removed (fb-595.68.4)
</commit_message>
<xml_diff>
--- a/courts/national/board-of-immigration-appeals/brief-on-appeal/usage/OUTPUT-brief-on-appeal.docx
+++ b/courts/national/board-of-immigration-appeals/brief-on-appeal/usage/OUTPUT-brief-on-appeal.docx
@@ -300,6 +300,7 @@
       <w:pPr>
         <w:pStyle w:val="Single"/>
         <w:sectPr>
+          <w:footerReference w:type="default" r:id="rIdFtrNone"/>
           <w:pgSz w:w="12240" w:h="15840"/>
           <w:pgMar w:top="1440" w:right="1440" w:bottom="1440" w:left="1440" w:header="720" w:footer="720" w:gutter="0"/>
         </w:sectPr>
@@ -2057,9 +2058,6 @@
     </w:tbl>
     <w:sectPr>
       <w:footerReference w:type="default" r:id="rIdBiaFooter1"/>
-      <w:footnotePr>
-        <w:numRestart w:val="eachSect"/>
-      </w:footnotePr>
       <w:pgSz w:w="12240" w:h="15840"/>
       <w:pgMar w:top="1440" w:right="1440" w:bottom="1440" w:left="1440" w:header="720" w:footer="720" w:gutter="0"/>
       <w:pgNumType w:start="1"/>
@@ -2072,7 +2070,252 @@
 <w:comments xmlns:w="http://schemas.openxmlformats.org/wordprocessingml/2006/main" xmlns:m="http://schemas.openxmlformats.org/officeDocument/2006/math" xmlns:r="http://schemas.openxmlformats.org/officeDocument/2006/relationships" xmlns:o="urn:schemas-microsoft-com:office:office" xmlns:v="urn:schemas-microsoft-com:vml" xmlns:w10="urn:schemas-microsoft-com:office:word" xmlns:a="http://schemas.openxmlformats.org/drawingml/2006/main" xmlns:pic="http://schemas.openxmlformats.org/drawingml/2006/picture" xmlns:wp="http://schemas.openxmlformats.org/drawingml/2006/wordprocessingDrawing"/>
 </file>
 
-<file path=word/footer1.xml><?xml version="1.0" encoding="utf-8"?>
+<file path=word/footnotes.xml><?xml version="1.0" encoding="utf-8"?>
+<w:footnotes xmlns:w="http://schemas.openxmlformats.org/wordprocessingml/2006/main" xmlns:m="http://schemas.openxmlformats.org/officeDocument/2006/math" xmlns:r="http://schemas.openxmlformats.org/officeDocument/2006/relationships" xmlns:o="urn:schemas-microsoft-com:office:office" xmlns:v="urn:schemas-microsoft-com:vml" xmlns:w10="urn:schemas-microsoft-com:office:word" xmlns:a="http://schemas.openxmlformats.org/drawingml/2006/main" xmlns:pic="http://schemas.openxmlformats.org/drawingml/2006/picture" xmlns:wp="http://schemas.openxmlformats.org/drawingml/2006/wordprocessingDrawing">
+  <w:footnote w:type="continuationSeparator" w:id="0">
+    <w:p>
+      <w:r>
+        <w:continuationSeparator/>
+      </w:r>
+    </w:p>
+  </w:footnote>
+  <w:footnote w:type="separator" w:id="-1">
+    <w:p>
+      <w:r>
+        <w:separator/>
+      </w:r>
+    </w:p>
+  </w:footnote>
+  <w:footnote w:id="11">
+    <w:p>
+      <w:pPr>
+        <w:pStyle w:val="FootnoteText"/>
+      </w:pPr>
+      <w:r>
+        <w:rPr>
+          <w:rStyle w:val="FootnoteReference"/>
+        </w:rPr>
+        <w:footnoteRef/>
+      </w:r>
+      <w:r>
+        <w:t xml:space="preserve"> </w:t>
+      </w:r>
+      <w:r>
+        <w:t xml:space="preserve">Exhibit R1 refers to supplemental documents filed by Ms. A-B- in 2018.</w:t>
+      </w:r>
+    </w:p>
+  </w:footnote>
+  <w:footnote w:id="13">
+    <w:p>
+      <w:pPr>
+        <w:pStyle w:val="FootnoteText"/>
+      </w:pPr>
+      <w:r>
+        <w:rPr>
+          <w:rStyle w:val="FootnoteReference"/>
+        </w:rPr>
+        <w:footnoteRef/>
+      </w:r>
+      <w:r>
+        <w:t xml:space="preserve"> </w:t>
+      </w:r>
+      <w:r>
+        <w:t xml:space="preserve">“I.J.”</w:t>
+      </w:r>
+      <w:r>
+        <w:t xml:space="preserve"> </w:t>
+      </w:r>
+      <w:r>
+        <w:t xml:space="preserve">refers to the IJ’s October 10, 2018 decision, except where specified.</w:t>
+      </w:r>
+    </w:p>
+  </w:footnote>
+  <w:footnote w:id="14">
+    <w:p>
+      <w:pPr>
+        <w:pStyle w:val="FootnoteText"/>
+      </w:pPr>
+      <w:r>
+        <w:rPr>
+          <w:rStyle w:val="FootnoteReference"/>
+        </w:rPr>
+        <w:footnoteRef/>
+      </w:r>
+      <w:r>
+        <w:t xml:space="preserve"> </w:t>
+      </w:r>
+      <w:r>
+        <w:t xml:space="preserve">“Tr. 2”</w:t>
+      </w:r>
+      <w:r>
+        <w:t xml:space="preserve"> </w:t>
+      </w:r>
+      <w:r>
+        <w:t xml:space="preserve">refers to the official transcript of the August 18, 2017 hearing.</w:t>
+      </w:r>
+    </w:p>
+  </w:footnote>
+  <w:footnote w:id="15">
+    <w:p>
+      <w:pPr>
+        <w:pStyle w:val="FootnoteText"/>
+      </w:pPr>
+      <w:r>
+        <w:rPr>
+          <w:rStyle w:val="FootnoteReference"/>
+        </w:rPr>
+        <w:footnoteRef/>
+      </w:r>
+      <w:r>
+        <w:t xml:space="preserve"> </w:t>
+      </w:r>
+      <w:r>
+        <w:t xml:space="preserve">The applicant in</w:t>
+      </w:r>
+      <w:r>
+        <w:t xml:space="preserve"> </w:t>
+      </w:r>
+      <w:r>
+        <w:rPr>
+          <w:i/>
+          <w:iCs/>
+        </w:rPr>
+        <w:t xml:space="preserve">Velasquez</w:t>
+      </w:r>
+      <w:r>
+        <w:t xml:space="preserve"> </w:t>
+      </w:r>
+      <w:r>
+        <w:t xml:space="preserve">fled El Salvador after being threatened by the mother of her late husband, who wanted the applicant to relinquish custody over her minor child. 866 F.3d at 191-92. The applicant claimed that she was persecuted on account of her membership in a particular social group consisting of her nuclear family, but the Fourth Circuit rejected the claim, holding that substantial evidence supported the agency conclusion that her family membership was not a central reason for the persecution.</w:t>
+      </w:r>
+      <w:r>
+        <w:t xml:space="preserve"> </w:t>
+      </w:r>
+      <w:r>
+        <w:rPr>
+          <w:i/>
+          <w:iCs/>
+        </w:rPr>
+        <w:t xml:space="preserve">Id.</w:t>
+      </w:r>
+      <w:r>
+        <w:t xml:space="preserve"> </w:t>
+      </w:r>
+      <w:r>
+        <w:t xml:space="preserve">at 194-96. The Court also rejected the applicant’s reliance on</w:t>
+      </w:r>
+      <w:r>
+        <w:t xml:space="preserve"> </w:t>
+      </w:r>
+      <w:r>
+        <w:rPr>
+          <w:i/>
+          <w:iCs/>
+        </w:rPr>
+        <w:t xml:space="preserve">A-R-C-G-</w:t>
+      </w:r>
+      <w:r>
+        <w:t xml:space="preserve">, noting that the validity of the social group in that case</w:t>
+      </w:r>
+      <w:r>
+        <w:t xml:space="preserve"> </w:t>
+      </w:r>
+      <w:r>
+        <w:t xml:space="preserve">“is not at issue”</w:t>
+      </w:r>
+      <w:r>
+        <w:t xml:space="preserve"> </w:t>
+      </w:r>
+      <w:r>
+        <w:t xml:space="preserve">and</w:t>
+      </w:r>
+      <w:r>
+        <w:t xml:space="preserve"> </w:t>
+      </w:r>
+      <w:r>
+        <w:t xml:space="preserve">“does not bear on our nexus analysis.”</w:t>
+      </w:r>
+      <w:r>
+        <w:t xml:space="preserve"> </w:t>
+      </w:r>
+      <w:r>
+        <w:rPr>
+          <w:i/>
+          <w:iCs/>
+        </w:rPr>
+        <w:t xml:space="preserve">Id.</w:t>
+      </w:r>
+      <w:r>
+        <w:t xml:space="preserve"> </w:t>
+      </w:r>
+      <w:r>
+        <w:t xml:space="preserve">at 195 n.5.</w:t>
+      </w:r>
+    </w:p>
+  </w:footnote>
+  <w:footnote w:id="16">
+    <w:p>
+      <w:pPr>
+        <w:pStyle w:val="FootnoteText"/>
+      </w:pPr>
+      <w:r>
+        <w:rPr>
+          <w:rStyle w:val="FootnoteReference"/>
+        </w:rPr>
+        <w:footnoteRef/>
+      </w:r>
+      <w:r>
+        <w:t xml:space="preserve"> </w:t>
+      </w:r>
+      <w:r>
+        <w:t xml:space="preserve">Available at https://www.justice.gov/opa/speech/attorney-general-sessions-delivers-remarks-executive-office-immigration-review-legal.</w:t>
+      </w:r>
+    </w:p>
+  </w:footnote>
+</w:footnotes>
+</file>
+
+<file path=word/ftr-add.xml><?xml version="1.0" encoding="utf-8"?>
+<w:ftr xmlns:w="http://schemas.openxmlformats.org/wordprocessingml/2006/main" xmlns:r="http://schemas.openxmlformats.org/officeDocument/2006/relationships">
+  <w:p>
+    <w:pPr>
+      <w:spacing w:before="0" w:after="0"/>
+      <w:jc w:val="center"/>
+    </w:pPr>
+    <w:r>
+      <w:t>Add-</w:t>
+    </w:r>
+    <w:r>
+      <w:fldChar w:fldCharType="begin"/>
+    </w:r>
+    <w:r>
+      <w:instrText xml:space="preserve"> PAGE </w:instrText>
+    </w:r>
+    <w:r>
+      <w:fldChar w:fldCharType="separate"/>
+    </w:r>
+    <w:r>
+      <w:t>1</w:t>
+    </w:r>
+    <w:r>
+      <w:fldChar w:fldCharType="end"/>
+    </w:r>
+  </w:p>
+</w:ftr>
+</file>
+
+<file path=word/ftr-none.xml><?xml version="1.0" encoding="utf-8"?>
+<w:ftr xmlns:w="http://schemas.openxmlformats.org/wordprocessingml/2006/main" xmlns:r="http://schemas.openxmlformats.org/officeDocument/2006/relationships">
+  <w:p>
+    <w:pPr>
+      <w:spacing w:before="0" w:after="0"/>
+      <w:jc w:val="center"/>
+    </w:pPr>
+  </w:p>
+</w:ftr>
+</file>
+
+<file path=word/ftr-own1.xml><?xml version="1.0" encoding="utf-8"?>
 <w:ftr xmlns:w="http://schemas.openxmlformats.org/wordprocessingml/2006/main" xmlns:r="http://schemas.openxmlformats.org/officeDocument/2006/relationships">
   <w:p>
     <w:pPr>
@@ -2106,209 +2349,30 @@
 </w:ftr>
 </file>
 
-<file path=word/footnotes.xml><?xml version="1.0" encoding="utf-8"?>
-<w:footnotes xmlns:w="http://schemas.openxmlformats.org/wordprocessingml/2006/main" xmlns:m="http://schemas.openxmlformats.org/officeDocument/2006/math" xmlns:r="http://schemas.openxmlformats.org/officeDocument/2006/relationships" xmlns:o="urn:schemas-microsoft-com:office:office" xmlns:v="urn:schemas-microsoft-com:vml" xmlns:w10="urn:schemas-microsoft-com:office:word" xmlns:a="http://schemas.openxmlformats.org/drawingml/2006/main" xmlns:pic="http://schemas.openxmlformats.org/drawingml/2006/picture" xmlns:wp="http://schemas.openxmlformats.org/drawingml/2006/wordprocessingDrawing">
-  <w:footnote w:type="continuationSeparator" w:id="0">
-    <w:p>
-      <w:r>
-        <w:continuationSeparator/>
-      </w:r>
-    </w:p>
-  </w:footnote>
-  <w:footnote w:type="separator" w:id="-1">
-    <w:p>
-      <w:r>
-        <w:separator/>
-      </w:r>
-    </w:p>
-  </w:footnote>
-  <w:footnote w:id="11">
-    <w:p>
-      <w:pPr>
-        <w:pStyle w:val="FootnoteText"/>
-      </w:pPr>
-      <w:r>
-        <w:rPr>
-          <w:rStyle w:val="FootnoteReference"/>
-        </w:rPr>
-        <w:footnoteRef/>
-      </w:r>
-      <w:r>
-        <w:t xml:space="preserve"> </w:t>
-      </w:r>
-      <w:r>
-        <w:t xml:space="preserve">Exhibit R1 refers to supplemental documents filed by Ms. A-B- in 2018.</w:t>
-      </w:r>
-    </w:p>
-  </w:footnote>
-  <w:footnote w:id="13">
-    <w:p>
-      <w:pPr>
-        <w:pStyle w:val="FootnoteText"/>
-      </w:pPr>
-      <w:r>
-        <w:rPr>
-          <w:rStyle w:val="FootnoteReference"/>
-        </w:rPr>
-        <w:footnoteRef/>
-      </w:r>
-      <w:r>
-        <w:t xml:space="preserve"> </w:t>
-      </w:r>
-      <w:r>
-        <w:t xml:space="preserve">“I.J.”</w:t>
-      </w:r>
-      <w:r>
-        <w:t xml:space="preserve"> </w:t>
-      </w:r>
-      <w:r>
-        <w:t xml:space="preserve">refers to the IJ’s October 10, 2018 decision, except where specified.</w:t>
-      </w:r>
-    </w:p>
-  </w:footnote>
-  <w:footnote w:id="14">
-    <w:p>
-      <w:pPr>
-        <w:pStyle w:val="FootnoteText"/>
-      </w:pPr>
-      <w:r>
-        <w:rPr>
-          <w:rStyle w:val="FootnoteReference"/>
-        </w:rPr>
-        <w:footnoteRef/>
-      </w:r>
-      <w:r>
-        <w:t xml:space="preserve"> </w:t>
-      </w:r>
-      <w:r>
-        <w:t xml:space="preserve">“Tr. 2”</w:t>
-      </w:r>
-      <w:r>
-        <w:t xml:space="preserve"> </w:t>
-      </w:r>
-      <w:r>
-        <w:t xml:space="preserve">refers to the official transcript of the August 18, 2017 hearing.</w:t>
-      </w:r>
-    </w:p>
-  </w:footnote>
-  <w:footnote w:id="15">
-    <w:p>
-      <w:pPr>
-        <w:pStyle w:val="FootnoteText"/>
-      </w:pPr>
-      <w:r>
-        <w:rPr>
-          <w:rStyle w:val="FootnoteReference"/>
-        </w:rPr>
-        <w:footnoteRef/>
-      </w:r>
-      <w:r>
-        <w:t xml:space="preserve"> </w:t>
-      </w:r>
-      <w:r>
-        <w:t xml:space="preserve">The applicant in</w:t>
-      </w:r>
-      <w:r>
-        <w:t xml:space="preserve"> </w:t>
-      </w:r>
-      <w:r>
-        <w:rPr>
-          <w:i/>
-          <w:iCs/>
-        </w:rPr>
-        <w:t xml:space="preserve">Velasquez</w:t>
-      </w:r>
-      <w:r>
-        <w:t xml:space="preserve"> </w:t>
-      </w:r>
-      <w:r>
-        <w:t xml:space="preserve">fled El Salvador after being threatened by the mother of her late husband, who wanted the applicant to relinquish custody over her minor child. 866 F.3d at 191-92. The applicant claimed that she was persecuted on account of her membership in a particular social group consisting of her nuclear family, but the Fourth Circuit rejected the claim, holding that substantial evidence supported the agency conclusion that her family membership was not a central reason for the persecution.</w:t>
-      </w:r>
-      <w:r>
-        <w:t xml:space="preserve"> </w:t>
-      </w:r>
-      <w:r>
-        <w:rPr>
-          <w:i/>
-          <w:iCs/>
-        </w:rPr>
-        <w:t xml:space="preserve">Id.</w:t>
-      </w:r>
-      <w:r>
-        <w:t xml:space="preserve"> </w:t>
-      </w:r>
-      <w:r>
-        <w:t xml:space="preserve">at 194-96. The Court also rejected the applicant’s reliance on</w:t>
-      </w:r>
-      <w:r>
-        <w:t xml:space="preserve"> </w:t>
-      </w:r>
-      <w:r>
-        <w:rPr>
-          <w:i/>
-          <w:iCs/>
-        </w:rPr>
-        <w:t xml:space="preserve">A-R-C-G-</w:t>
-      </w:r>
-      <w:r>
-        <w:t xml:space="preserve">, noting that the validity of the social group in that case</w:t>
-      </w:r>
-      <w:r>
-        <w:t xml:space="preserve"> </w:t>
-      </w:r>
-      <w:r>
-        <w:t xml:space="preserve">“is not at issue”</w:t>
-      </w:r>
-      <w:r>
-        <w:t xml:space="preserve"> </w:t>
-      </w:r>
-      <w:r>
-        <w:t xml:space="preserve">and</w:t>
-      </w:r>
-      <w:r>
-        <w:t xml:space="preserve"> </w:t>
-      </w:r>
-      <w:r>
-        <w:t xml:space="preserve">“does not bear on our nexus analysis.”</w:t>
-      </w:r>
-      <w:r>
-        <w:t xml:space="preserve"> </w:t>
-      </w:r>
-      <w:r>
-        <w:rPr>
-          <w:i/>
-          <w:iCs/>
-        </w:rPr>
-        <w:t xml:space="preserve">Id.</w:t>
-      </w:r>
-      <w:r>
-        <w:t xml:space="preserve"> </w:t>
-      </w:r>
-      <w:r>
-        <w:t xml:space="preserve">at 195 n.5.</w:t>
-      </w:r>
-    </w:p>
-  </w:footnote>
-  <w:footnote w:id="16">
-    <w:p>
-      <w:pPr>
-        <w:pStyle w:val="FootnoteText"/>
-      </w:pPr>
-      <w:r>
-        <w:rPr>
-          <w:rStyle w:val="FootnoteReference"/>
-        </w:rPr>
-        <w:footnoteRef/>
-      </w:r>
-      <w:r>
-        <w:t xml:space="preserve"> </w:t>
-      </w:r>
-      <w:r>
-        <w:t xml:space="preserve">Available at https://www.justice.gov/opa/speech/attorney-general-sessions-delivers-remarks-executive-office-immigration-review-legal.</w:t>
-      </w:r>
-    </w:p>
-  </w:footnote>
-</w:footnotes>
+<file path=word/ftr-page.xml><?xml version="1.0" encoding="utf-8"?>
+<w:ftr xmlns:w="http://schemas.openxmlformats.org/wordprocessingml/2006/main" xmlns:r="http://schemas.openxmlformats.org/officeDocument/2006/relationships">
+  <w:p>
+    <w:pPr>
+      <w:spacing w:before="0" w:after="0"/>
+      <w:jc w:val="center"/>
+    </w:pPr>
+    <w:r>
+      <w:fldChar w:fldCharType="begin"/>
+    </w:r>
+    <w:r>
+      <w:instrText xml:space="preserve"> PAGE </w:instrText>
+    </w:r>
+    <w:r>
+      <w:fldChar w:fldCharType="separate"/>
+    </w:r>
+    <w:r>
+      <w:t>1</w:t>
+    </w:r>
+    <w:r>
+      <w:fldChar w:fldCharType="end"/>
+    </w:r>
+  </w:p>
+</w:ftr>
 </file>
 
 <file path=word/numbering.xml><?xml version="1.0" encoding="utf-8"?>
@@ -2515,7 +2579,7 @@
   <w:docDefaults>
     <w:rPrDefault>
       <w:rPr>
-        <w:rFonts w:ascii="Liberation Serif" w:hAnsi="Liberation Serif" w:eastAsia="Liberation Serif" w:cs="Liberation Serif"/>
+        <w:rFonts w:ascii="Times New Roman" w:hAnsi="Times New Roman" w:eastAsia="Times New Roman" w:cs="Times New Roman"/>
         <w:sz w:val="24"/>
         <w:szCs w:val="24"/>
         <w:lang w:val="en-US" w:eastAsia="en-US" w:bidi="ar-SA"/>
@@ -2529,6 +2593,49 @@
     </w:pPrDefault>
   </w:docDefaults>
   <w:latentStyles w:defLockedState="0" w:defUIPriority="0" w:defSemiHidden="0" w:defUnhideWhenUsed="0" w:defQFormat="0" w:count="276"/>
+  <w:style w:type="paragraph" w:default="1" w:styleId="Normal">
+    <w:name w:val="Normal"/>
+    <w:qFormat/>
+    <w:pPr>
+      <w:widowControl/>
+      <w:spacing w:before="0" w:after="0" w:line="575" w:lineRule="exact"/>
+      <w:ind w:firstLine="0"/>
+    </w:pPr>
+    <w:rPr>
+      <w:rFonts w:ascii="Times New Roman" w:hAnsi="Times New Roman" w:eastAsia="Times New Roman" w:cs="Times New Roman"/>
+      <w:color w:val="000000"/>
+      <w:sz w:val="24"/>
+      <w:szCs w:val="24"/>
+    </w:rPr>
+  </w:style>
+  <w:style w:type="paragraph" w:styleId="BodyText">
+    <w:name w:val="Body Text"/>
+    <w:basedOn w:val="Normal"/>
+    <w:qFormat/>
+    <w:pPr>
+      <w:spacing w:before="0" w:after="0" w:line="575" w:lineRule="exact"/>
+      <w:ind w:firstLine="720"/>
+    </w:pPr>
+  </w:style>
+  <w:style w:type="paragraph" w:styleId="FirstParagraph">
+    <w:name w:val="First Paragraph"/>
+    <w:basedOn w:val="BodyText"/>
+    <w:next w:val="BodyText"/>
+    <w:qFormat/>
+    <w:pPr>
+      <w:spacing w:before="0" w:after="0" w:line="575" w:lineRule="exact"/>
+      <w:ind w:firstLine="0"/>
+    </w:pPr>
+  </w:style>
+  <w:style w:type="paragraph" w:styleId="Compact">
+    <w:name w:val="Compact"/>
+    <w:basedOn w:val="BodyText"/>
+    <w:qFormat/>
+    <w:pPr>
+      <w:spacing w:before="0" w:after="0" w:line="575" w:lineRule="exact"/>
+      <w:ind w:firstLine="0"/>
+    </w:pPr>
+  </w:style>
   <w:style w:type="paragraph" w:styleId="Title">
     <w:name w:val="Title"/>
     <w:basedOn w:val="Normal"/>
@@ -2661,6 +2768,74 @@
     <w:qFormat/>
     <w:pPr/>
     <w:rPr/>
+  </w:style>
+  <w:style w:type="paragraph" w:styleId="Heading1">
+    <w:name w:val="heading 1"/>
+    <w:basedOn w:val="Normal"/>
+    <w:next w:val="FirstParagraph"/>
+    <w:uiPriority w:val="9"/>
+    <w:qFormat/>
+    <w:pPr>
+      <w:keepNext/>
+      <w:keepLines/>
+      <w:spacing w:before="288" w:after="288" w:line="240" w:lineRule="auto"/>
+      <w:ind w:firstLine="0"/>
+      <w:outlineLvl w:val="0"/>
+    </w:pPr>
+    <w:rPr>
+      <w:b/>
+      <w:bCs/>
+      <w:caps/>
+      <w:color w:val="000000"/>
+      <w:sz w:val="34"/>
+      <w:szCs w:val="34"/>
+    </w:rPr>
+  </w:style>
+  <w:style w:type="paragraph" w:styleId="Heading2">
+    <w:name w:val="heading 2"/>
+    <w:basedOn w:val="Normal"/>
+    <w:next w:val="FirstParagraph"/>
+    <w:uiPriority w:val="9"/>
+    <w:unhideWhenUsed/>
+    <w:qFormat/>
+    <w:pPr>
+      <w:keepNext/>
+      <w:keepLines/>
+      <w:spacing w:before="240" w:after="240" w:line="240" w:lineRule="auto"/>
+      <w:ind w:firstLine="0"/>
+      <w:outlineLvl w:val="1"/>
+    </w:pPr>
+    <w:rPr>
+      <w:b/>
+      <w:bCs/>
+      <w:color w:val="000000"/>
+      <w:sz w:val="29"/>
+      <w:szCs w:val="29"/>
+    </w:rPr>
+  </w:style>
+  <w:style w:type="paragraph" w:styleId="Heading3">
+    <w:name w:val="heading 3"/>
+    <w:basedOn w:val="Normal"/>
+    <w:next w:val="FirstParagraph"/>
+    <w:uiPriority w:val="9"/>
+    <w:unhideWhenUsed/>
+    <w:qFormat/>
+    <w:pPr>
+      <w:keepNext/>
+      <w:keepLines/>
+      <w:spacing w:before="240" w:after="240" w:line="240" w:lineRule="auto"/>
+      <w:ind w:firstLine="0"/>
+      <w:outlineLvl w:val="2"/>
+    </w:pPr>
+    <w:rPr>
+      <w:b/>
+      <w:bCs/>
+      <w:i/>
+      <w:iCs/>
+      <w:color w:val="000000"/>
+      <w:sz w:val="24"/>
+      <w:szCs w:val="24"/>
+    </w:rPr>
   </w:style>
   <w:style w:type="paragraph" w:styleId="Heading4">
     <w:name w:val="heading 4"/>
@@ -2911,6 +3086,31 @@
     <w:rPr>
       <w:rFonts w:eastAsiaTheme="majorEastAsia" w:cstheme="majorBidi"/>
       <w:color w:val="272727" w:themeColor="text1" w:themeTint="D8"/>
+    </w:rPr>
+  </w:style>
+  <w:style w:type="paragraph" w:styleId="BlockText">
+    <w:name w:val="Block Text"/>
+    <w:basedOn w:val="Normal"/>
+    <w:next w:val="BodyText"/>
+    <w:uiPriority w:val="9"/>
+    <w:qFormat/>
+    <w:pPr>
+      <w:spacing w:before="240" w:after="240" w:line="240" w:lineRule="auto"/>
+      <w:ind w:left="720" w:right="720" w:firstLine="0"/>
+    </w:pPr>
+  </w:style>
+  <w:style w:type="paragraph" w:styleId="FootnoteText">
+    <w:name w:val="footnote text"/>
+    <w:basedOn w:val="Normal"/>
+    <w:uiPriority w:val="99"/>
+    <w:unhideWhenUsed/>
+    <w:pPr>
+      <w:spacing w:before="0" w:after="120" w:line="240" w:lineRule="auto"/>
+      <w:ind w:firstLine="0"/>
+    </w:pPr>
+    <w:rPr>
+      <w:sz w:val="24"/>
+      <w:szCs w:val="24"/>
     </w:rPr>
   </w:style>
   <w:style w:type="paragraph" w:styleId="FootnoteBlockText">
@@ -3049,142 +3249,6 @@
       <w:b w:val="0"/>
       <w:bCs w:val="0"/>
       <w:color w:val="365F91" w:themeColor="accent1" w:themeShade="BF"/>
-    </w:rPr>
-  </w:style>
-  <w:style w:type="paragraph" w:default="1" w:styleId="Normal">
-    <w:name w:val="Normal"/>
-    <w:qFormat/>
-    <w:pPr>
-      <w:widowControl/>
-      <w:spacing w:before="0" w:after="0" w:line="575" w:lineRule="exact"/>
-      <w:ind w:firstLine="0"/>
-    </w:pPr>
-    <w:rPr>
-      <w:rFonts w:ascii="Liberation Serif" w:hAnsi="Liberation Serif" w:eastAsia="Liberation Serif" w:cs="Liberation Serif"/>
-      <w:color w:val="000000"/>
-      <w:sz w:val="24"/>
-      <w:szCs w:val="24"/>
-    </w:rPr>
-  </w:style>
-  <w:style w:type="paragraph" w:styleId="BodyText">
-    <w:name w:val="Body Text"/>
-    <w:basedOn w:val="Normal"/>
-    <w:qFormat/>
-    <w:pPr>
-      <w:spacing w:before="0" w:after="0" w:line="575" w:lineRule="exact"/>
-      <w:ind w:firstLine="720"/>
-    </w:pPr>
-  </w:style>
-  <w:style w:type="paragraph" w:styleId="FirstParagraph">
-    <w:name w:val="First Paragraph"/>
-    <w:basedOn w:val="BodyText"/>
-    <w:next w:val="BodyText"/>
-    <w:qFormat/>
-    <w:pPr>
-      <w:spacing w:before="0" w:after="0" w:line="575" w:lineRule="exact"/>
-      <w:ind w:firstLine="0"/>
-    </w:pPr>
-  </w:style>
-  <w:style w:type="paragraph" w:styleId="Compact">
-    <w:name w:val="Compact"/>
-    <w:basedOn w:val="BodyText"/>
-    <w:qFormat/>
-    <w:pPr>
-      <w:spacing w:before="0" w:after="0" w:line="575" w:lineRule="exact"/>
-      <w:ind w:firstLine="0"/>
-    </w:pPr>
-  </w:style>
-  <w:style w:type="paragraph" w:styleId="Heading1">
-    <w:name w:val="heading 1"/>
-    <w:basedOn w:val="Normal"/>
-    <w:next w:val="FirstParagraph"/>
-    <w:uiPriority w:val="9"/>
-    <w:qFormat/>
-    <w:pPr>
-      <w:keepNext/>
-      <w:keepLines/>
-      <w:spacing w:before="288" w:after="288" w:line="240" w:lineRule="auto"/>
-      <w:ind w:firstLine="0"/>
-      <w:outlineLvl w:val="0"/>
-    </w:pPr>
-    <w:rPr>
-      <w:b/>
-      <w:bCs/>
-      <w:caps/>
-      <w:color w:val="000000"/>
-      <w:sz w:val="34"/>
-      <w:szCs w:val="34"/>
-    </w:rPr>
-  </w:style>
-  <w:style w:type="paragraph" w:styleId="Heading2">
-    <w:name w:val="heading 2"/>
-    <w:basedOn w:val="Normal"/>
-    <w:next w:val="FirstParagraph"/>
-    <w:uiPriority w:val="9"/>
-    <w:unhideWhenUsed/>
-    <w:qFormat/>
-    <w:pPr>
-      <w:keepNext/>
-      <w:keepLines/>
-      <w:spacing w:before="240" w:after="240" w:line="240" w:lineRule="auto"/>
-      <w:ind w:firstLine="0"/>
-      <w:outlineLvl w:val="1"/>
-    </w:pPr>
-    <w:rPr>
-      <w:b/>
-      <w:bCs/>
-      <w:color w:val="000000"/>
-      <w:sz w:val="29"/>
-      <w:szCs w:val="29"/>
-    </w:rPr>
-  </w:style>
-  <w:style w:type="paragraph" w:styleId="Heading3">
-    <w:name w:val="heading 3"/>
-    <w:basedOn w:val="Normal"/>
-    <w:next w:val="FirstParagraph"/>
-    <w:uiPriority w:val="9"/>
-    <w:unhideWhenUsed/>
-    <w:qFormat/>
-    <w:pPr>
-      <w:keepNext/>
-      <w:keepLines/>
-      <w:spacing w:before="240" w:after="240" w:line="240" w:lineRule="auto"/>
-      <w:ind w:firstLine="0"/>
-      <w:outlineLvl w:val="2"/>
-    </w:pPr>
-    <w:rPr>
-      <w:b/>
-      <w:bCs/>
-      <w:i/>
-      <w:iCs/>
-      <w:color w:val="000000"/>
-      <w:sz w:val="24"/>
-      <w:szCs w:val="24"/>
-    </w:rPr>
-  </w:style>
-  <w:style w:type="paragraph" w:styleId="BlockText">
-    <w:name w:val="Block Text"/>
-    <w:basedOn w:val="Normal"/>
-    <w:next w:val="BodyText"/>
-    <w:uiPriority w:val="9"/>
-    <w:qFormat/>
-    <w:pPr>
-      <w:spacing w:before="240" w:after="240" w:line="240" w:lineRule="auto"/>
-      <w:ind w:left="720" w:right="720" w:firstLine="0"/>
-    </w:pPr>
-  </w:style>
-  <w:style w:type="paragraph" w:styleId="FootnoteText">
-    <w:name w:val="footnote text"/>
-    <w:basedOn w:val="Normal"/>
-    <w:uiPriority w:val="99"/>
-    <w:unhideWhenUsed/>
-    <w:pPr>
-      <w:spacing w:before="0" w:after="120" w:line="240" w:lineRule="auto"/>
-      <w:ind w:firstLine="0"/>
-    </w:pPr>
-    <w:rPr>
-      <w:sz w:val="24"/>
-      <w:szCs w:val="24"/>
     </w:rPr>
   </w:style>
   <w:style w:type="paragraph" w:styleId="Footer">

</xml_diff>